<commit_message>
Caught up on logbook, added unity scripts for basic enemy movement, fuel movement, the player scripts for movement and constraining the player within bounds, the spawnmanager and the gamemanager script
</commit_message>
<xml_diff>
--- a/Documents/Game Design Document Best Education.docx
+++ b/Documents/Game Design Document Best Education.docx
@@ -2341,8 +2341,9 @@
                       <w:szCs w:val="22"/>
                       <w:lang w:val="en-US"/>
                     </w:rPr>
-                    <w:t xml:space="preserve"> as well as the max speed they can spawn with</w:t>
+                    <w:t xml:space="preserve"> as well as the max speed they can </w:t>
                   </w:r>
+                  <w:proofErr w:type="gramStart"/>
                   <w:r>
                     <w:rPr>
                       <w:rFonts w:ascii="Cabin" w:eastAsia="Cabin" w:hAnsi="Cabin" w:cs="Cabin"/>
@@ -2352,8 +2353,9 @@
                       <w:szCs w:val="22"/>
                       <w:lang w:val="en-US"/>
                     </w:rPr>
-                    <w:t xml:space="preserve"> </w:t>
+                    <w:t>spawn with</w:t>
                   </w:r>
+                  <w:proofErr w:type="gramEnd"/>
                   <w:r>
                     <w:rPr>
                       <w:rFonts w:ascii="Cabin" w:eastAsia="Cabin" w:hAnsi="Cabin" w:cs="Cabin"/>
@@ -2363,18 +2365,7 @@
                       <w:szCs w:val="22"/>
                       <w:lang w:val="en-US"/>
                     </w:rPr>
-                    <w:t>will increase</w:t>
-                  </w:r>
-                  <w:r>
-                    <w:rPr>
-                      <w:rFonts w:ascii="Cabin" w:eastAsia="Cabin" w:hAnsi="Cabin" w:cs="Cabin"/>
-                      <w:i/>
-                      <w:color w:val="B7B7B7"/>
-                      <w:sz w:val="22"/>
-                      <w:szCs w:val="22"/>
-                      <w:lang w:val="en-US"/>
-                    </w:rPr>
-                    <w:t xml:space="preserve"> on higher levels and fuel will be less common</w:t>
+                    <w:t xml:space="preserve"> will increase on higher levels and fuel will be less common</w:t>
                   </w:r>
                 </w:p>
               </w:tc>

</xml_diff>